<commit_message>
Refresh personal academic portfolio and remove university details
</commit_message>
<xml_diff>
--- a/Mustafa_Haytham_Remote_CV_ATS.docx
+++ b/Mustafa_Haytham_Remote_CV_ATS.docx
@@ -47,16 +47,6 @@
       </w:r>
     </w:p>
     <w:p>
-      <w:r>
-        <w:t>National University – Sudan</w:t>
-      </w:r>
-    </w:p>
-    <w:p>
-      <w:r>
-        <w:t>Expected Graduation: —</w:t>
-      </w:r>
-    </w:p>
-    <w:p>
       <w:pPr>
         <w:pStyle w:val="Heading1"/>
       </w:pPr>
@@ -94,7 +84,7 @@
     </w:p>
     <w:p>
       <w:r>
-        <w:t>Online Tutor (Freelance) | 2023 – Present</w:t>
+        <w:t>Online Tutor (Freelance)</w:t>
       </w:r>
     </w:p>
     <w:p>
@@ -109,7 +99,7 @@
     </w:p>
     <w:p>
       <w:r>
-        <w:t>Medical Content Creator (Self-initiated) | 2024 – Present</w:t>
+        <w:t>Medical Content Creator (Self-initiated)</w:t>
       </w:r>
     </w:p>
     <w:p>
@@ -124,7 +114,7 @@
     </w:p>
     <w:p>
       <w:r>
-        <w:t>Clinical Observations &amp; Training (Student Practice) | 2023 – Present</w:t>
+        <w:t>Clinical Observations &amp; Training (Student Practice)</w:t>
       </w:r>
     </w:p>
     <w:p>

</xml_diff>

<commit_message>
Polish CV into a readable single page
</commit_message>
<xml_diff>
--- a/Mustafa_Haytham_Remote_CV_ATS.docx
+++ b/Mustafa_Haytham_Remote_CV_ATS.docx
@@ -160,7 +160,7 @@
     </w:p>
     <w:sectPr>
       <w:pgSz w:w="12240" w:h="15840"/>
-      <w:pgMar w:top="1440" w:right="1800" w:bottom="1440" w:left="1800" w:header="720" w:footer="720" w:gutter="0"/>
+      <w:pgMar w:top="1008" w:right="1152" w:bottom="1008" w:left="1152" w:header="720" w:footer="720" w:gutter="0"/>
       <w:cols w:space="720"/>
       <w:docGrid w:linePitch="360"/>
     </w:sectPr>
@@ -531,6 +531,13 @@
     <w:name w:val="Normal"/>
     <w:qFormat/>
     <w:rsid w:val="00FC693F"/>
+    <w:pPr>
+      <w:spacing w:after="60" w:line="254" w:lineRule="auto"/>
+    </w:pPr>
+    <w:rPr>
+      <w:rFonts w:ascii="Arial" w:hAnsi="Arial"/>
+      <w:sz w:val="20"/>
+    </w:rPr>
   </w:style>
   <w:style w:type="paragraph" w:styleId="Header">
     <w:name w:val="header"/>
@@ -587,15 +594,15 @@
     <w:pPr>
       <w:keepNext/>
       <w:keepLines/>
-      <w:spacing w:before="480" w:after="0"/>
+      <w:spacing w:before="180" w:after="60"/>
       <w:outlineLvl w:val="0"/>
     </w:pPr>
     <w:rPr>
-      <w:rFonts w:asciiTheme="majorHAnsi" w:eastAsiaTheme="majorEastAsia" w:hAnsiTheme="majorHAnsi" w:cstheme="majorBidi"/>
+      <w:rFonts w:asciiTheme="majorHAnsi" w:eastAsiaTheme="majorEastAsia" w:hAnsiTheme="majorHAnsi" w:cstheme="majorBidi" w:ascii="Arial" w:hAnsi="Arial"/>
       <w:b/>
       <w:bCs/>
-      <w:color w:val="365F91" w:themeColor="accent1" w:themeShade="BF"/>
-      <w:sz w:val="28"/>
+      <w:color w:val="392146"/>
+      <w:sz w:val="23"/>
       <w:szCs w:val="28"/>
     </w:rPr>
   </w:style>
@@ -876,15 +883,15 @@
       <w:pBdr>
         <w:bottom w:val="single" w:sz="8" w:space="4" w:color="4F81BD" w:themeColor="accent1"/>
       </w:pBdr>
-      <w:spacing w:after="300" w:line="240" w:lineRule="auto"/>
+      <w:spacing w:after="100" w:line="240" w:lineRule="auto"/>
       <w:contextualSpacing/>
     </w:pPr>
     <w:rPr>
-      <w:rFonts w:asciiTheme="majorHAnsi" w:eastAsiaTheme="majorEastAsia" w:hAnsiTheme="majorHAnsi" w:cstheme="majorBidi"/>
-      <w:color w:val="17365D" w:themeColor="text2" w:themeShade="BF"/>
+      <w:rFonts w:asciiTheme="majorHAnsi" w:eastAsiaTheme="majorEastAsia" w:hAnsiTheme="majorHAnsi" w:cstheme="majorBidi" w:ascii="Arial" w:hAnsi="Arial"/>
+      <w:color w:val="392146"/>
       <w:spacing w:val="5"/>
       <w:kern w:val="28"/>
-      <w:sz w:val="52"/>
+      <w:sz w:val="40"/>
       <w:szCs w:val="52"/>
     </w:rPr>
   </w:style>

</xml_diff>

<commit_message>
Align personal profile and CV with supplied LinkedIn export
</commit_message>
<xml_diff>
--- a/Mustafa_Haytham_Remote_CV_ATS.docx
+++ b/Mustafa_Haytham_Remote_CV_ATS.docx
@@ -17,7 +17,7 @@
     </w:p>
     <w:p>
       <w:r>
-        <w:t>LinkedIn: linkedin.com/in/mustafa-ahmed-9bb7942b4</w:t>
+        <w:t>LinkedIn: linkedin.com/in/mustafa-haytham-9bb7942b4</w:t>
       </w:r>
     </w:p>
     <w:p>
@@ -30,7 +30,7 @@
     </w:p>
     <w:p>
       <w:r>
-        <w:t>Motivated and adaptable medical student with strong communication skills, bilingual proficiency (Arabic &amp; English), and proven ability to work independently. Skilled in online research, clinical observation, patient interaction, content writing, tutoring, and administrative support. Seeking part-time remote opportunities to develop professional experience while continuing medical studies.</w:t>
+        <w:t>Medical student and founder of AUNO Center with interests in research capacity building, data analysis, scientific communication, and education. Experience in tutoring and academic content creation, with skills in poster and graphic design.</w:t>
       </w:r>
     </w:p>
     <w:p>
@@ -60,6 +60,12 @@
       </w:r>
     </w:p>
     <w:p>
+      <w:pPr/>
+      <w:r>
+        <w:t>Research and Design Skills: Data analysis, poster design, graphic design</w:t>
+      </w:r>
+    </w:p>
+    <w:p>
       <w:r>
         <w:t>Technical Skills: Microsoft Word, Excel, PowerPoint, Google Workspace, Email Communication</w:t>
       </w:r>
@@ -80,6 +86,18 @@
       </w:pPr>
       <w:r>
         <w:t>Experience</w:t>
+      </w:r>
+    </w:p>
+    <w:p>
+      <w:pPr/>
+      <w:r>
+        <w:t>Founder, AUNO Center</w:t>
+      </w:r>
+    </w:p>
+    <w:p>
+      <w:pPr/>
+      <w:r>
+        <w:t>- Founded a research office focused on scientific work, mentorship, collaboration, and capacity building.</w:t>
       </w:r>
     </w:p>
     <w:p>

</xml_diff>